<commit_message>
Capturas nuevas de consola y escritorio (mensaje de intentos del servidor, imagen); manual y presentacion regenerados
</commit_message>
<xml_diff>
--- a/05. DOCUMENTACIÓN/WS_CONUNI_RESTFUL_DOTNET_GR01.docx
+++ b/05. DOCUMENTACIÓN/WS_CONUNI_RESTFUL_DOTNET_GR01.docx
@@ -10648,7 +10648,7 @@
       <w:r>
         <w:drawing>
           <wp:inline distT="0" distB="0" distL="0" distR="0">
-            <wp:extent cx="5715000" cy="2667000"/>
+            <wp:extent cx="5715000" cy="2847975"/>
             <wp:effectExtent t="0" r="0" b="0" l="0"/>
             <wp:docPr id="7" name="01_login_error.png" descr="CLICON: login incorrecto (el servidor respondió 401 con los intentos restantes)." title="CLICON: login incorrecto (el servidor respondió 401 con los intentos restantes)."/>
             <wp:cNvGraphicFramePr>
@@ -10673,7 +10673,7 @@
                   <pic:spPr bwMode="auto">
                     <a:xfrm>
                       <a:off x="0" y="0"/>
-                      <a:ext cx="5715000" cy="2667000"/>
+                      <a:ext cx="5715000" cy="2847975"/>
                     </a:xfrm>
                     <a:prstGeom prst="rect">
                       <a:avLst/>
@@ -10711,7 +10711,7 @@
       <w:r>
         <w:drawing>
           <wp:inline distT="0" distB="0" distL="0" distR="0">
-            <wp:extent cx="5191125" cy="3143250"/>
+            <wp:extent cx="5715000" cy="2686050"/>
             <wp:effectExtent t="0" r="0" b="0" l="0"/>
             <wp:docPr id="8" name="02_menu.png" descr="CLICON: menú principal de categorías." title="CLICON: menú principal de categorías."/>
             <wp:cNvGraphicFramePr>
@@ -10736,7 +10736,7 @@
                   <pic:spPr bwMode="auto">
                     <a:xfrm>
                       <a:off x="0" y="0"/>
-                      <a:ext cx="5191125" cy="3143250"/>
+                      <a:ext cx="5715000" cy="2686050"/>
                     </a:xfrm>
                     <a:prstGeom prst="rect">
                       <a:avLst/>
@@ -10774,7 +10774,7 @@
       <w:r>
         <w:drawing>
           <wp:inline distT="0" distB="0" distL="0" distR="0">
-            <wp:extent cx="5715000" cy="2667000"/>
+            <wp:extent cx="5715000" cy="2686050"/>
             <wp:effectExtent t="0" r="0" b="0" l="0"/>
             <wp:docPr id="9" name="03_resultado.png" descr="CLICON: 100 °C = 212 °F." title="CLICON: 100 °C = 212 °F."/>
             <wp:cNvGraphicFramePr>
@@ -10799,7 +10799,7 @@
                   <pic:spPr bwMode="auto">
                     <a:xfrm>
                       <a:off x="0" y="0"/>
-                      <a:ext cx="5715000" cy="2667000"/>
+                      <a:ext cx="5715000" cy="2686050"/>
                     </a:xfrm>
                     <a:prstGeom prst="rect">
                       <a:avLst/>
@@ -10837,7 +10837,7 @@
       <w:r>
         <w:drawing>
           <wp:inline distT="0" distB="0" distL="0" distR="0">
-            <wp:extent cx="5715000" cy="2667000"/>
+            <wp:extent cx="5715000" cy="2352675"/>
             <wp:effectExtent t="0" r="0" b="0" l="0"/>
             <wp:docPr id="10" name="04_error.png" descr="CLICON: valor bajo el cero absoluto rechazado por el servidor (HTTP 400)." title="CLICON: valor bajo el cero absoluto rechazado por el servidor (HTTP 400)."/>
             <wp:cNvGraphicFramePr>
@@ -10862,7 +10862,7 @@
                   <pic:spPr bwMode="auto">
                     <a:xfrm>
                       <a:off x="0" y="0"/>
-                      <a:ext cx="5715000" cy="2667000"/>
+                      <a:ext cx="5715000" cy="2352675"/>
                     </a:xfrm>
                     <a:prstGeom prst="rect">
                       <a:avLst/>
@@ -10900,7 +10900,7 @@
       <w:r>
         <w:drawing>
           <wp:inline distT="0" distB="0" distL="0" distR="0">
-            <wp:extent cx="5715000" cy="2667000"/>
+            <wp:extent cx="5715000" cy="2686050"/>
             <wp:effectExtent t="0" r="0" b="0" l="0"/>
             <wp:docPr id="11" name="05_longitud.png" descr="CLICON: 10 km = 6.213712 mi." title="CLICON: 10 km = 6.213712 mi."/>
             <wp:cNvGraphicFramePr>
@@ -10925,7 +10925,7 @@
                   <pic:spPr bwMode="auto">
                     <a:xfrm>
                       <a:off x="0" y="0"/>
-                      <a:ext cx="5715000" cy="2667000"/>
+                      <a:ext cx="5715000" cy="2686050"/>
                     </a:xfrm>
                     <a:prstGeom prst="rect">
                       <a:avLst/>
@@ -11885,7 +11885,7 @@
       <w:r>
         <w:drawing>
           <wp:inline distT="0" distB="0" distL="0" distR="0">
-            <wp:extent cx="5715000" cy="2819400"/>
+            <wp:extent cx="5715000" cy="3143250"/>
             <wp:effectExtent t="0" r="0" b="0" l="0"/>
             <wp:docPr id="15" name="05_longitud.png" descr="CLIESC: 1 m = 3.28084 ft." title="CLIESC: 1 m = 3.28084 ft."/>
             <wp:cNvGraphicFramePr>
@@ -11910,7 +11910,7 @@
                   <pic:spPr bwMode="auto">
                     <a:xfrm>
                       <a:off x="0" y="0"/>
-                      <a:ext cx="5715000" cy="2819400"/>
+                      <a:ext cx="5715000" cy="3143250"/>
                     </a:xfrm>
                     <a:prstGeom prst="rect">
                       <a:avLst/>
@@ -11948,7 +11948,7 @@
       <w:r>
         <w:drawing>
           <wp:inline distT="0" distB="0" distL="0" distR="0">
-            <wp:extent cx="5715000" cy="2819400"/>
+            <wp:extent cx="5715000" cy="3143250"/>
             <wp:effectExtent t="0" r="0" b="0" l="0"/>
             <wp:docPr id="16" name="06_masa.png" descr="CLIESC: 1 kg = 2.204623 lb." title="CLIESC: 1 kg = 2.204623 lb."/>
             <wp:cNvGraphicFramePr>
@@ -11973,7 +11973,7 @@
                   <pic:spPr bwMode="auto">
                     <a:xfrm>
                       <a:off x="0" y="0"/>
-                      <a:ext cx="5715000" cy="2819400"/>
+                      <a:ext cx="5715000" cy="3143250"/>
                     </a:xfrm>
                     <a:prstGeom prst="rect">
                       <a:avLst/>

</xml_diff>

<commit_message>
Renumerar capturas de escritorio y web sin huecos; manual y presentacion regenerados
</commit_message>
<xml_diff>
--- a/05. DOCUMENTACIÓN/WS_CONUNI_RESTFUL_DOTNET_GR01.docx
+++ b/05. DOCUMENTACIÓN/WS_CONUNI_RESTFUL_DOTNET_GR01.docx
@@ -11875,7 +11875,7 @@
           <wp:inline distT="0" distB="0" distL="0" distR="0">
             <wp:extent cx="5715000" cy="3448050"/>
             <wp:effectExtent t="0" r="0" b="0" l="0"/>
-            <wp:docPr id="14" name="03_temperatura.png" descr="CLIESC: cuadrícula Bento con resultado, historial, contador y servidor." title="CLIESC: cuadrícula Bento con resultado, historial, contador y servidor."/>
+            <wp:docPr id="14" name="02_temperatura.png" descr="CLIESC: cuadrícula Bento con resultado, historial, contador y servidor." title="CLIESC: cuadrícula Bento con resultado, historial, contador y servidor."/>
             <wp:cNvGraphicFramePr>
               <a:graphicFrameLocks xmlns:a="http://schemas.openxmlformats.org/drawingml/2006/main" noChangeAspect="1"/>
             </wp:cNvGraphicFramePr>
@@ -11939,7 +11939,7 @@
           <wp:inline distT="0" distB="0" distL="0" distR="0">
             <wp:extent cx="5715000" cy="3448050"/>
             <wp:effectExtent t="0" r="0" b="0" l="0"/>
-            <wp:docPr id="15" name="04_temperatura_error.png" descr="CLIESC: valor bajo el cero absoluto rechazado por el servidor (tarjeta en rojo)." title="CLIESC: valor bajo el cero absoluto rechazado por el servidor (tarjeta en rojo)."/>
+            <wp:docPr id="15" name="03_temperatura_error.png" descr="CLIESC: valor bajo el cero absoluto rechazado por el servidor (tarjeta en rojo)." title="CLIESC: valor bajo el cero absoluto rechazado por el servidor (tarjeta en rojo)."/>
             <wp:cNvGraphicFramePr>
               <a:graphicFrameLocks xmlns:a="http://schemas.openxmlformats.org/drawingml/2006/main" noChangeAspect="1"/>
             </wp:cNvGraphicFramePr>
@@ -12003,7 +12003,7 @@
           <wp:inline distT="0" distB="0" distL="0" distR="0">
             <wp:extent cx="5715000" cy="3448050"/>
             <wp:effectExtent t="0" r="0" b="0" l="0"/>
-            <wp:docPr id="16" name="05_longitud.png" descr="CLIESC: 1 m = 3.28084 ft." title="CLIESC: 1 m = 3.28084 ft."/>
+            <wp:docPr id="16" name="04_longitud.png" descr="CLIESC: 1 m = 3.28084 ft." title="CLIESC: 1 m = 3.28084 ft."/>
             <wp:cNvGraphicFramePr>
               <a:graphicFrameLocks xmlns:a="http://schemas.openxmlformats.org/drawingml/2006/main" noChangeAspect="1"/>
             </wp:cNvGraphicFramePr>
@@ -12067,7 +12067,7 @@
           <wp:inline distT="0" distB="0" distL="0" distR="0">
             <wp:extent cx="5715000" cy="3448050"/>
             <wp:effectExtent t="0" r="0" b="0" l="0"/>
-            <wp:docPr id="17" name="06_masa.png" descr="CLIESC: 1 kg = 2.204623 lb." title="CLIESC: 1 kg = 2.204623 lb."/>
+            <wp:docPr id="17" name="05_masa.png" descr="CLIESC: 1 kg = 2.204623 lb." title="CLIESC: 1 kg = 2.204623 lb."/>
             <wp:cNvGraphicFramePr>
               <a:graphicFrameLocks xmlns:a="http://schemas.openxmlformats.org/drawingml/2006/main" noChangeAspect="1"/>
             </wp:cNvGraphicFramePr>
@@ -14049,7 +14049,7 @@
           <wp:inline distT="0" distB="0" distL="0" distR="0">
             <wp:extent cx="5715000" cy="3571875"/>
             <wp:effectExtent t="0" r="0" b="0" l="0"/>
-            <wp:docPr id="21" name="05_longitud.png" descr="CLIWEB: conversión de longitud." title="CLIWEB: conversión de longitud."/>
+            <wp:docPr id="21" name="04_longitud.png" descr="CLIWEB: conversión de longitud." title="CLIWEB: conversión de longitud."/>
             <wp:cNvGraphicFramePr>
               <a:graphicFrameLocks xmlns:a="http://schemas.openxmlformats.org/drawingml/2006/main" noChangeAspect="1"/>
             </wp:cNvGraphicFramePr>
@@ -14113,7 +14113,7 @@
           <wp:inline distT="0" distB="0" distL="0" distR="0">
             <wp:extent cx="1619250" cy="5334000"/>
             <wp:effectExtent t="0" r="0" b="0" l="0"/>
-            <wp:docPr id="22" name="06_masa_celular.png" descr="CLIWEB: diseño adaptable en pantalla de celular." title="CLIWEB: diseño adaptable en pantalla de celular."/>
+            <wp:docPr id="22" name="05_masa_celular.png" descr="CLIWEB: diseño adaptable en pantalla de celular." title="CLIWEB: diseño adaptable en pantalla de celular."/>
             <wp:cNvGraphicFramePr>
               <a:graphicFrameLocks xmlns:a="http://schemas.openxmlformats.org/drawingml/2006/main" noChangeAspect="1"/>
             </wp:cNvGraphicFramePr>

</xml_diff>